<commit_message>
Agrega manuales de la API de Biostar y del núcleo del negocio
- MANUAL_API_BIOSTAR.docx: endpoint de sincronización con Biostar, cómo se
  genera la fichada y crea el usuario automáticamente, y una nota de
  seguridad importante: POST /api/biostar/events no tiene autenticación.
- MANUAL_API_NUCLEO.docx: login/refresh, menú del día por turno y comedor,
  comandas (pedidos, con y sin cálculo de descuento) y el motor de reglas de
  bonificación (condiciones, efectos, prioridad).
- README.docx: actualizado con los dos manuales nuevos en el índice.

Co-Authored-By: Claude Sonnet 5 <noreply@anthropic.com>
</commit_message>
<xml_diff>
--- a/documentos/README.docx
+++ b/documentos/README.docx
@@ -83,7 +83,103 @@
           <w:p>
             <w:r/>
             <w:r>
-              <w:t>[INFORME_AUDITORIA_SEGURIDAD_API.md](INFORME_AUDITORIA_SEGURIDAD_API.md)</w:t>
+              <w:t>MANUAL_API_NUCLEO.docx</w:t>
+            </w:r>
+          </w:p>
+        </w:tc>
+        <w:tc>
+          <w:tcPr>
+            <w:tcW w:type="dxa" w:w="4320"/>
+          </w:tcPr>
+          <w:p>
+            <w:r/>
+            <w:r>
+              <w:t>Login, menú del día, comandas (pedidos) y motor de reglas de bonificación — el flujo central de la app.</w:t>
+            </w:r>
+          </w:p>
+        </w:tc>
+      </w:tr>
+      <w:tr>
+        <w:tc>
+          <w:tcPr>
+            <w:tcW w:type="dxa" w:w="4320"/>
+          </w:tcPr>
+          <w:p>
+            <w:r/>
+            <w:r>
+              <w:t>MANUAL_API_SMARTTIME.docx</w:t>
+            </w:r>
+          </w:p>
+        </w:tc>
+        <w:tc>
+          <w:tcPr>
+            <w:tcW w:type="dxa" w:w="4320"/>
+          </w:tcPr>
+          <w:p>
+            <w:r/>
+            <w:r>
+              <w:t>Cómo consumir los endpoints de la integración SmartTime (autenticación, crear/listar/editar/dar de baja usuarios).</w:t>
+            </w:r>
+          </w:p>
+        </w:tc>
+      </w:tr>
+      <w:tr>
+        <w:tc>
+          <w:tcPr>
+            <w:tcW w:type="dxa" w:w="4320"/>
+          </w:tcPr>
+          <w:p>
+            <w:r/>
+            <w:r>
+              <w:t>MANUAL_API_BIOSTAR.docx</w:t>
+            </w:r>
+          </w:p>
+        </w:tc>
+        <w:tc>
+          <w:tcPr>
+            <w:tcW w:type="dxa" w:w="4320"/>
+          </w:tcPr>
+          <w:p>
+            <w:r/>
+            <w:r>
+              <w:t>Cómo funciona la integración con Biostar (control de acceso) y cómo se generan las fichadas automáticamente.</w:t>
+            </w:r>
+          </w:p>
+        </w:tc>
+      </w:tr>
+      <w:tr>
+        <w:tc>
+          <w:tcPr>
+            <w:tcW w:type="dxa" w:w="4320"/>
+          </w:tcPr>
+          <w:p>
+            <w:r/>
+            <w:r>
+              <w:t>FRONTEND_REFRESH_TOKEN.docx</w:t>
+            </w:r>
+          </w:p>
+        </w:tc>
+        <w:tc>
+          <w:tcPr>
+            <w:tcW w:type="dxa" w:w="4320"/>
+          </w:tcPr>
+          <w:p>
+            <w:r/>
+            <w:r>
+              <w:t>Cómo debe usar el frontend el refresh token para renovar la sesión sin desloguear al usuario.</w:t>
+            </w:r>
+          </w:p>
+        </w:tc>
+      </w:tr>
+      <w:tr>
+        <w:tc>
+          <w:tcPr>
+            <w:tcW w:type="dxa" w:w="4320"/>
+          </w:tcPr>
+          <w:p>
+            <w:r/>
+            <w:r>
+              <w:t>INFORME_AUDITORIA_SEGURIDAD_API.docx</w:t>
             </w:r>
           </w:p>
         </w:tc>
@@ -107,55 +203,7 @@
           <w:p>
             <w:r/>
             <w:r>
-              <w:t>[MANUAL_API_SMARTTIME.md](MANUAL_API_SMARTTIME.md)</w:t>
-            </w:r>
-          </w:p>
-        </w:tc>
-        <w:tc>
-          <w:tcPr>
-            <w:tcW w:type="dxa" w:w="4320"/>
-          </w:tcPr>
-          <w:p>
-            <w:r/>
-            <w:r>
-              <w:t>Cómo consumir los endpoints de la integración SmartTime (autenticación, crear/listar/editar/dar de baja usuarios).</w:t>
-            </w:r>
-          </w:p>
-        </w:tc>
-      </w:tr>
-      <w:tr>
-        <w:tc>
-          <w:tcPr>
-            <w:tcW w:type="dxa" w:w="4320"/>
-          </w:tcPr>
-          <w:p>
-            <w:r/>
-            <w:r>
-              <w:t>[FRONTEND_REFRESH_TOKEN.md](FRONTEND_REFRESH_TOKEN.md)</w:t>
-            </w:r>
-          </w:p>
-        </w:tc>
-        <w:tc>
-          <w:tcPr>
-            <w:tcW w:type="dxa" w:w="4320"/>
-          </w:tcPr>
-          <w:p>
-            <w:r/>
-            <w:r>
-              <w:t>Cómo debe usar el frontend el refresh token para renovar la sesión sin desloguear al usuario.</w:t>
-            </w:r>
-          </w:p>
-        </w:tc>
-      </w:tr>
-      <w:tr>
-        <w:tc>
-          <w:tcPr>
-            <w:tcW w:type="dxa" w:w="4320"/>
-          </w:tcPr>
-          <w:p>
-            <w:r/>
-            <w:r>
-              <w:t>[CONFIGURAR_CONEXION_SA.md](CONFIGURAR_CONEXION_SA.md)</w:t>
+              <w:t>CONFIGURAR_CONEXION_SA.docx</w:t>
             </w:r>
           </w:p>
         </w:tc>

</xml_diff>